<commit_message>
docs: adopt three-star competition ball and link calibration resources (#77)
</commit_message>
<xml_diff>
--- a/HOPE_AI_Challenge_2026_Rules_ZH.docx
+++ b/HOPE_AI_Challenge_2026_Rules_ZH.docx
@@ -2895,7 +2895,7 @@
           <w:rtl w:val="0"/>
           <w:lang w:val="zh-TW" w:eastAsia="zh-TW"/>
         </w:rPr>
-        <w:t xml:space="preserve">）比赛用球。比赛使用 </w:t>
+        <w:t xml:space="preserve">）比赛用球。本赛项正式采用 </w:t>
       </w:r>
       <w:r>
         <w:rPr>
@@ -2918,7 +2918,7 @@
           <w:rtl w:val="0"/>
           <w:lang w:val="zh-TW" w:eastAsia="zh-TW"/>
         </w:rPr>
-        <w:t xml:space="preserve">认可的 </w:t>
+        <w:t xml:space="preserve">认可的专业三星级 </w:t>
       </w:r>
       <w:r>
         <w:rPr>
@@ -2941,7 +2941,7 @@
           <w:rtl w:val="0"/>
           <w:lang w:val="zh-TW" w:eastAsia="zh-TW"/>
         </w:rPr>
-        <w:t xml:space="preserve">塑料球，球的直径、重量、公差等物理参数按 ITTF 当年度技术规范执行，颜色由组委会统一指定；为便于动作捕捉跟踪，组委会提供已贴附微型反光标记或采用反光涂层处理的 </w:t>
+        <w:t xml:space="preserve">塑料乒乓球作为比赛用球，球的直径、重量、公差等物理参数按 ITTF 当年度技术规范执行，颜色由组委会统一指定；为便于动作捕捉跟踪，组委会提供已贴附微型反光标记或采用反光涂层处理的 </w:t>
       </w:r>
       <w:r>
         <w:rPr>

</xml_diff>